<commit_message>
study: enhance report and scripts for required course evaluation
Update the Phase 0 report to include new findings from the evaluation of required courses, specifically Operating Systems and Data Structures. Revise the report to clarify the limitations and next steps, and introduce a power analysis based on real data. Additionally, modify scripts to support required course models, including block floor calculations and adjustments to the pathway generation process. Update dependencies in requirements.txt to include necessary libraries for statistical analysis.
</commit_message>
<xml_diff>
--- a/study/report.docx
+++ b/study/report.docx
@@ -7136,7 +7136,17 @@
         <w:t>We only tested one syllabus.</w:t>
       </w:r>
       <w:r>
-        <w:t xml:space="preserve"> The team agreed to rerun this whole process on a second, different syllabus (a discrete math course has been proposed) with a fresh set of profiles, to make sure the result isn't specific to this one AI-literacy course.</w:t>
+        <w:t xml:space="preserve"> This is now underway: two real courses, Operating Systems (CS-UH 3010) and Data Structures (CS-UH 1050), are being run through an extended version of this pipeline. Those courses are required and cumulative rather than elective, which turned out to need a different definition of "personalized" than the one this report uses — see </w:t>
+      </w:r>
+      <w:r>
+        <w:rPr>
+          <w:rFonts w:ascii="Courier New" w:hAnsi="Courier New"/>
+          <w:sz w:val="20"/>
+        </w:rPr>
+        <w:t>study/report_required_courses.md</w:t>
+      </w:r>
+      <w:r>
+        <w:t xml:space="preserve"> for the full writeup and results.</w:t>
       </w:r>
     </w:p>
     <w:p>
@@ -7147,10 +7157,39 @@
         <w:rPr>
           <w:b/>
         </w:rPr>
-        <w:t>50 profiles is a starting point, not a final sample size.</w:t>
+        <w:t>Power analysis: done, using real Run 3 data instead of a guessed target.</w:t>
       </w:r>
       <w:r>
-        <w:t xml:space="preserve"> The team plans a proper power analysis (a statistical method for deciding how many samples are actually needed) before scaling up, with roughly 200 profiles discussed as a target.</w:t>
+        <w:t xml:space="preserve"> </w:t>
+      </w:r>
+      <w:r>
+        <w:rPr>
+          <w:rFonts w:ascii="Courier New" w:hAnsi="Courier New"/>
+          <w:sz w:val="20"/>
+        </w:rPr>
+        <w:t>scripts/13_power_analysis.py</w:t>
+      </w:r>
+      <w:r>
+        <w:t xml:space="preserve"> computed the actual effect size (Cohen's d) for every contrast this report uses, across every profile that matches each contrast's real criteria (not just the two named anchors), then solved for the sample size needed to detect that effect at 80% power. Result: our current contrasts are large enough (Cohen's d from 1.1 to 8.8) that as few as 2-11 profiles per group would already reliably detect them — nowhere near the 200 originally discussed. The one gate that does keep improving with more profiles is the diversity score's precision: bootstrapping the mean pairwise-Jaccard estimate shows its 95% confidence interval shrinks from ±0.078 at 10 profiles to ±0.016 at 40, so more profiles buy tighter precision on that number, not detection of a signal that's already this strong. </w:t>
+      </w:r>
+      <w:r>
+        <w:rPr>
+          <w:b/>
+        </w:rPr>
+        <w:t>Important caveat:</w:t>
+      </w:r>
+      <w:r>
+        <w:t xml:space="preserve"> these large effect sizes partly reflect how rigidly our synthetic profiles trigger the prompt's keyword-based rules (96% rule compliance) — real students in Phase 1 will likely produce noisier, less rule-triggering answers, so this result validates *this specific synthetic pilot*, not necessarily the effect size we'd see with real students. Full numbers: </w:t>
+      </w:r>
+      <w:r>
+        <w:rPr>
+          <w:rFonts w:ascii="Courier New" w:hAnsi="Courier New"/>
+          <w:sz w:val="20"/>
+        </w:rPr>
+        <w:t>data/results/reports/power_analysis.json</w:t>
+      </w:r>
+      <w:r>
+        <w:t>.</w:t>
       </w:r>
     </w:p>
     <w:p>
@@ -7531,6 +7570,34 @@
             <w:r/>
             <w:r>
               <w:t>Generates all 50 pathways in a batch, and can resume if interrupted</w:t>
+            </w:r>
+          </w:p>
+        </w:tc>
+      </w:tr>
+      <w:tr>
+        <w:tc>
+          <w:tcPr>
+            <w:tcW w:type="dxa" w:w="4320"/>
+          </w:tcPr>
+          <w:p>
+            <w:r/>
+            <w:r>
+              <w:rPr>
+                <w:rFonts w:ascii="Courier New" w:hAnsi="Courier New"/>
+                <w:sz w:val="20"/>
+              </w:rPr>
+              <w:t>scripts/13_power_analysis.py</w:t>
+            </w:r>
+          </w:p>
+        </w:tc>
+        <w:tc>
+          <w:tcPr>
+            <w:tcW w:type="dxa" w:w="4320"/>
+          </w:tcPr>
+          <w:p>
+            <w:r/>
+            <w:r>
+              <w:t>Computes real effect sizes and required sample sizes from Run 3 data</w:t>
             </w:r>
           </w:p>
         </w:tc>

</xml_diff>